<commit_message>
refactor(error-handling): replace generic RuntimeException with DockerOperationException
</commit_message>
<xml_diff>
--- a/Memoria_Docklite.docx
+++ b/Memoria_Docklite.docx
@@ -11467,10 +11467,7 @@
     </w:p>
     <w:p>
       <w:r>
-        <w:t xml:space="preserve">Las pruebas funcionales se han llevado a cabo mediante el cliente HTTP integrado en IntelliJ IDEA, utilizando </w:t>
-      </w:r>
-      <w:r>
-        <w:t xml:space="preserve">ficheros </w:t>
+        <w:t xml:space="preserve">Las pruebas funcionales se han llevado a cabo mediante el cliente HTTP integrado en IntelliJ IDEA, utilizando ficheros </w:t>
       </w:r>
       <w:r>
         <w:rPr>
@@ -11912,11 +11909,17 @@
     </w:p>
     <w:p/>
     <w:p>
-      <w:r>
+      <w:pPr>
+        <w:jc w:val="center"/>
+      </w:pPr>
+      <w:r>
+        <w:rPr>
+          <w:noProof/>
+        </w:rPr>
         <w:drawing>
-          <wp:inline distT="0" distB="0" distL="0" distR="0" wp14:anchorId="4E7CBAFD" wp14:editId="66ACCCCE">
-            <wp:extent cx="5760720" cy="2641600"/>
-            <wp:effectExtent l="0" t="0" r="0" b="6350"/>
+          <wp:inline distT="0" distB="0" distL="0" distR="0" wp14:anchorId="4E7CBAFD" wp14:editId="255F7549">
+            <wp:extent cx="5072933" cy="2326213"/>
+            <wp:effectExtent l="0" t="0" r="0" b="0"/>
             <wp:docPr id="1593418884" name="Imagen 1"/>
             <wp:cNvGraphicFramePr>
               <a:graphicFrameLocks xmlns:a="http://schemas.openxmlformats.org/drawingml/2006/main" noChangeAspect="1"/>
@@ -11937,7 +11940,7 @@
                   <pic:spPr>
                     <a:xfrm>
                       <a:off x="0" y="0"/>
-                      <a:ext cx="5760720" cy="2641600"/>
+                      <a:ext cx="5085607" cy="2332025"/>
                     </a:xfrm>
                     <a:prstGeom prst="rect">
                       <a:avLst/>
@@ -11964,26 +11967,21 @@
         <w:t xml:space="preserve"> Gate, un conjunto de criterios mínimos que debe cumplir el código para considerarse apto. El uso continuado de SonarQube durante el desarrollo ha permitido detectar problemas en fases tempranas y aplicar correcciones progresivas, manteniendo la calidad del código bajo control durante toda la implementación.</w:t>
       </w:r>
     </w:p>
-    <w:p/>
     <w:p>
       <w:r>
-        <w:br w:type="page"/>
+        <w:t>Issues detectadas por SonarQube:</w:t>
       </w:r>
     </w:p>
     <w:p>
-      <w:r>
-        <w:lastRenderedPageBreak/>
-        <w:t>Reglas detectadas y aplicadas</w:t>
-      </w:r>
-    </w:p>
-    <w:p/>
-    <w:p>
+      <w:pPr>
+        <w:jc w:val="center"/>
+      </w:pPr>
       <w:r>
         <w:drawing>
-          <wp:inline distT="0" distB="0" distL="0" distR="0" wp14:anchorId="00B42CCA" wp14:editId="315BCC1E">
-            <wp:extent cx="5760720" cy="2620645"/>
-            <wp:effectExtent l="0" t="0" r="0" b="8255"/>
-            <wp:docPr id="1236038815" name="Imagen 1"/>
+          <wp:inline distT="0" distB="0" distL="0" distR="0" wp14:anchorId="7A4DA2C2" wp14:editId="002D6D3A">
+            <wp:extent cx="4811725" cy="2759103"/>
+            <wp:effectExtent l="0" t="0" r="8255" b="3175"/>
+            <wp:docPr id="369343763" name="Imagen 1"/>
             <wp:cNvGraphicFramePr>
               <a:graphicFrameLocks xmlns:a="http://schemas.openxmlformats.org/drawingml/2006/main" noChangeAspect="1"/>
             </wp:cNvGraphicFramePr>
@@ -11991,7 +11989,7 @@
               <a:graphicData uri="http://schemas.openxmlformats.org/drawingml/2006/picture">
                 <pic:pic xmlns:pic="http://schemas.openxmlformats.org/drawingml/2006/picture">
                   <pic:nvPicPr>
-                    <pic:cNvPr id="1236038815" name=""/>
+                    <pic:cNvPr id="369343763" name=""/>
                     <pic:cNvPicPr/>
                   </pic:nvPicPr>
                   <pic:blipFill>
@@ -12003,7 +12001,7 @@
                   <pic:spPr>
                     <a:xfrm>
                       <a:off x="0" y="0"/>
-                      <a:ext cx="5760720" cy="2620645"/>
+                      <a:ext cx="4864712" cy="2789486"/>
                     </a:xfrm>
                     <a:prstGeom prst="rect">
                       <a:avLst/>
@@ -12016,26 +12014,63 @@
         </w:drawing>
       </w:r>
     </w:p>
-    <w:p/>
     <w:p>
       <w:r>
-        <w:t xml:space="preserve">A </w:t>
-      </w:r>
-      <w:r>
-        <w:t>continuación,</w:t>
-      </w:r>
-      <w:r>
-        <w:t xml:space="preserve"> se describen algunas de las issues detectadas por SonarQube durante el análisis del proyecto y las correcciones aplicadas:</w:t>
+        <w:lastRenderedPageBreak/>
+        <w:t>A continuación, se describen algunas de las issues detectadas por SonarQube durante el análisis del proyecto y las correcciones aplicadas:</w:t>
       </w:r>
     </w:p>
-    <w:p/>
     <w:p>
+      <w:pPr>
+        <w:rPr>
+          <w:b/>
+          <w:bCs/>
+        </w:rPr>
+      </w:pPr>
+      <w:r>
+        <w:rPr>
+          <w:b/>
+          <w:bCs/>
+        </w:rPr>
+        <w:t xml:space="preserve">Excepciones genéricas en operaciones Docker (regla </w:t>
+      </w:r>
+      <w:proofErr w:type="gramStart"/>
+      <w:r>
+        <w:rPr>
+          <w:b/>
+          <w:bCs/>
+        </w:rPr>
+        <w:t>java:S</w:t>
+      </w:r>
+      <w:proofErr w:type="gramEnd"/>
+      <w:r>
+        <w:rPr>
+          <w:b/>
+          <w:bCs/>
+        </w:rPr>
+        <w:t>112)</w:t>
+      </w:r>
+    </w:p>
+    <w:p>
+      <w:r>
+        <w:t xml:space="preserve">SonarQube detectó otro caso de la misma regla en el servicio encargado de gestionar contenedores, concretamente en el método responsable de garantizar la disponibilidad de una imagen antes de crear el contenedor. En él, una interrupción durante la descarga de la imagen se reenvolvía como una excepción genérica de tipo </w:t>
+      </w:r>
+      <w:proofErr w:type="spellStart"/>
+      <w:r>
+        <w:t>runtime</w:t>
+      </w:r>
+      <w:proofErr w:type="spellEnd"/>
+      <w:r>
+        <w:t>. Aunque funcionalmente correcto, lanzar una excepción genérica no aporta información sobre qué falló y dificulta el manejo diferenciado de los errores en la capa superior.</w:t>
+      </w:r>
+    </w:p>
+    <w:p>
       <w:r>
         <w:drawing>
-          <wp:inline distT="0" distB="0" distL="0" distR="0" wp14:anchorId="5367950C" wp14:editId="0EE29D76">
-            <wp:extent cx="5760720" cy="3292475"/>
-            <wp:effectExtent l="0" t="0" r="0" b="3175"/>
-            <wp:docPr id="585257139" name="Imagen 1"/>
+          <wp:inline distT="0" distB="0" distL="0" distR="0" wp14:anchorId="7D0B38B3" wp14:editId="5C86705C">
+            <wp:extent cx="5760720" cy="3281680"/>
+            <wp:effectExtent l="0" t="0" r="0" b="0"/>
+            <wp:docPr id="1437639094" name="Imagen 1"/>
             <wp:cNvGraphicFramePr>
               <a:graphicFrameLocks xmlns:a="http://schemas.openxmlformats.org/drawingml/2006/main" noChangeAspect="1"/>
             </wp:cNvGraphicFramePr>
@@ -12043,7 +12078,7 @@
               <a:graphicData uri="http://schemas.openxmlformats.org/drawingml/2006/picture">
                 <pic:pic xmlns:pic="http://schemas.openxmlformats.org/drawingml/2006/picture">
                   <pic:nvPicPr>
-                    <pic:cNvPr id="585257139" name=""/>
+                    <pic:cNvPr id="1437639094" name=""/>
                     <pic:cNvPicPr/>
                   </pic:nvPicPr>
                   <pic:blipFill>
@@ -12055,7 +12090,7 @@
                   <pic:spPr>
                     <a:xfrm>
                       <a:off x="0" y="0"/>
-                      <a:ext cx="5760720" cy="3292475"/>
+                      <a:ext cx="5760720" cy="3281680"/>
                     </a:xfrm>
                     <a:prstGeom prst="rect">
                       <a:avLst/>
@@ -12067,6 +12102,28 @@
           </wp:inline>
         </w:drawing>
       </w:r>
+    </w:p>
+    <w:p/>
+    <w:p>
+      <w:r>
+        <w:t xml:space="preserve">La solución consistió en crear una excepción específica del dominio, ubicada junto al resto de excepciones propias de la aplicación. Se sustituyó la excepción genérica de tipo </w:t>
+      </w:r>
+      <w:proofErr w:type="spellStart"/>
+      <w:r>
+        <w:t>runtime</w:t>
+      </w:r>
+      <w:proofErr w:type="spellEnd"/>
+      <w:r>
+        <w:t xml:space="preserve"> por esta nueva clase, y se aplicó el mismo cambio en el servicio de imágenes, donde se reproducía el mismo patrón al descargar una imagen. Adicionalmente se registró un manejador en el componente global de gestión de excepciones para devolver una respuesta 500 con un mensaje genérico, sin filtrar detalles internos al cliente.</w:t>
+      </w:r>
+    </w:p>
+    <w:p>
+      <w:pPr>
+        <w:rPr>
+          <w:b/>
+          <w:bCs/>
+        </w:rPr>
+      </w:pPr>
     </w:p>
     <w:p/>
     <w:p>

</xml_diff>